<commit_message>
TAS2O_School_Pre_Inspection_Package_Checklist_AI_Enhanced.docx 恢复了 readiness checklist 表格 保留 [ ] 作为检查状态位 不再把学校身份误写进 checklist 表格 TAS2O_Inspection_Binder_Index_Ministry_Submission_Checklist_AI_Enhanced.docx 补了 school identity 和 signoff 相关固定字段 TAS2O_Report_Card_Credit_Reporting_Procedure_AI_Enhanced.docx 补了 letter template 里的学校名称、联系方式、teacher、principal 保留学生姓名、OEN、成绩百分比、完成日期这类运行时字段 这次没有去硬填本来就应该在开课/出勤/结业时填写的字段
</commit_message>
<xml_diff>
--- a/04_Assessment_Attendance_and_Credit_Reporting/TAS2O_Report_Card_Credit_Reporting_Procedure_AI_Enhanced.docx
+++ b/04_Assessment_Attendance_and_Credit_Reporting/TAS2O_Report_Card_Credit_Reporting_Procedure_AI_Enhanced.docx
@@ -113,12 +113,7 @@
             <w:vAlign w:val="top"/>
           </w:tcPr>
           <w:p>
-            <w:r/>
-            <w:r>
-              <w:rPr>
-                <w:b w:val="0"/>
-                <w:sz w:val="18"/>
-              </w:rPr>
+            <w:r>
               <w:t>Webtree Academy</w:t>
             </w:r>
           </w:p>
@@ -147,12 +142,7 @@
             <w:vAlign w:val="top"/>
           </w:tcPr>
           <w:p>
-            <w:r/>
-            <w:r>
-              <w:rPr>
-                <w:b w:val="0"/>
-                <w:sz w:val="18"/>
-              </w:rPr>
+            <w:r>
               <w:t>883796</w:t>
             </w:r>
           </w:p>
@@ -181,12 +171,7 @@
             <w:vAlign w:val="top"/>
           </w:tcPr>
           <w:p>
-            <w:r/>
-            <w:r>
-              <w:rPr>
-                <w:b w:val="0"/>
-                <w:sz w:val="18"/>
-              </w:rPr>
+            <w:r>
               <w:t>Henry Michels</w:t>
             </w:r>
           </w:p>
@@ -215,12 +200,7 @@
             <w:vAlign w:val="top"/>
           </w:tcPr>
           <w:p>
-            <w:r/>
-            <w:r>
-              <w:rPr>
-                <w:b w:val="0"/>
-                <w:sz w:val="18"/>
-              </w:rPr>
+            <w:r>
               <w:t>TAS2O</w:t>
             </w:r>
           </w:p>
@@ -249,12 +229,7 @@
             <w:vAlign w:val="top"/>
           </w:tcPr>
           <w:p>
-            <w:r/>
-            <w:r>
-              <w:rPr>
-                <w:b w:val="0"/>
-                <w:sz w:val="18"/>
-              </w:rPr>
+            <w:r>
               <w:t>Technology and the Skilled Trades</w:t>
             </w:r>
           </w:p>
@@ -283,13 +258,8 @@
             <w:vAlign w:val="top"/>
           </w:tcPr>
           <w:p>
-            <w:r/>
-            <w:r>
-              <w:rPr>
-                <w:b w:val="0"/>
-                <w:sz w:val="18"/>
-              </w:rPr>
-              <w:t>Grade 10 / Open / 1.0 credit</w:t>
+            <w:r>
+              <w:t>Grade 10, Open, 1.0 credit</w:t>
             </w:r>
           </w:p>
         </w:tc>
@@ -317,12 +287,7 @@
             <w:vAlign w:val="top"/>
           </w:tcPr>
           <w:p>
-            <w:r/>
-            <w:r>
-              <w:rPr>
-                <w:b w:val="0"/>
-                <w:sz w:val="18"/>
-              </w:rPr>
+            <w:r>
               <w:t>Carlos Chen</w:t>
             </w:r>
           </w:p>
@@ -351,12 +316,7 @@
             <w:vAlign w:val="top"/>
           </w:tcPr>
           <w:p>
-            <w:r/>
-            <w:r>
-              <w:rPr>
-                <w:b w:val="0"/>
-                <w:sz w:val="18"/>
-              </w:rPr>
+            <w:r>
               <w:t>2026-2027 / Summer 2026</w:t>
             </w:r>
           </w:p>
@@ -385,12 +345,7 @@
             <w:vAlign w:val="top"/>
           </w:tcPr>
           <w:p>
-            <w:r/>
-            <w:r>
-              <w:rPr>
-                <w:b w:val="0"/>
-                <w:sz w:val="18"/>
-              </w:rPr>
+            <w:r>
               <w:t>2026-05-12</w:t>
             </w:r>
           </w:p>
@@ -3691,7 +3646,7 @@
         <w:spacing w:after="80"/>
       </w:pPr>
       <w:r>
-        <w:t>[School Letterhead]</w:t>
+        <w:t>Webtree Academy</w:t>
       </w:r>
     </w:p>
     <w:p>
@@ -3731,7 +3686,7 @@
         <w:spacing w:after="80"/>
       </w:pPr>
       <w:r>
-        <w:t>This letter confirms that [Student Legal Name] completed TAS2O - Technology and the Skilled Trades, Grade 10, Open, 1.0 credit, at [School Name] during [term/session dates].</w:t>
+        <w:t>This letter confirms that [Student Legal Name] completed TAS2O - Technology and the Skilled Trades, Grade 10, Open, 1.0 credit, at Webtree Academy during [term/session dates].</w:t>
       </w:r>
     </w:p>
     <w:p>
@@ -3784,7 +3739,7 @@
         <w:spacing w:after="80"/>
       </w:pPr>
       <w:r>
-        <w:t>Please contact [school contact information] if further verification is required.</w:t>
+        <w:t>Please contact https://www.webtreeedu.com/ | (416) 792-8280 | info@webtreeedu.com if further verification is required.</w:t>
       </w:r>
     </w:p>
     <w:p>
@@ -3805,7 +3760,7 @@
         <w:spacing w:after="80"/>
       </w:pPr>
       <w:r>
-        <w:t>[Principal / Designate Name and Signature]</w:t>
+        <w:t>Henry Michels</w:t>
       </w:r>
     </w:p>
     <w:p>
@@ -3905,13 +3860,8 @@
             <w:vAlign w:val="top"/>
           </w:tcPr>
           <w:p>
-            <w:r/>
-            <w:r>
-              <w:rPr>
-                <w:b w:val="0"/>
-                <w:sz w:val="18"/>
-              </w:rPr>
-              <w:t>[ ] Verified</w:t>
+            <w:r>
+              <w:t>Carlos Chen</w:t>
             </w:r>
           </w:p>
         </w:tc>
@@ -3954,13 +3904,8 @@
             <w:vAlign w:val="top"/>
           </w:tcPr>
           <w:p>
-            <w:r/>
-            <w:r>
-              <w:rPr>
-                <w:b w:val="0"/>
-                <w:sz w:val="18"/>
-              </w:rPr>
-              <w:t>[ ] Verified</w:t>
+            <w:r>
+              <w:t>Henry Michels</w:t>
             </w:r>
           </w:p>
         </w:tc>
@@ -4003,13 +3948,8 @@
             <w:vAlign w:val="top"/>
           </w:tcPr>
           <w:p>
-            <w:r/>
-            <w:r>
-              <w:rPr>
-                <w:b w:val="0"/>
-                <w:sz w:val="18"/>
-              </w:rPr>
-              <w:t>[ ] Verified</w:t>
+            <w:r>
+              <w:t>Webtree Academy Admin</w:t>
             </w:r>
           </w:p>
         </w:tc>

</xml_diff>